<commit_message>
Add customer profile page and update project proposal design
</commit_message>
<xml_diff>
--- a/project/Paw_Care_Pet_Shop_and_Veterinary_Service_Management_System/Project_Report/G_08_Project_Proposal_Paw_Care _Pet_Shop_and_Veterinary_Service_Management_System.docx
+++ b/project/Paw_Care_Pet_Shop_and_Veterinary_Service_Management_System/Project_Report/G_08_Project_Proposal_Paw_Care _Pet_Shop_and_Veterinary_Service_Management_System.docx
@@ -2671,16 +2671,16 @@
                 <w:szCs w:val="22"/>
               </w:rPr>
               <w:drawing>
-                <wp:anchor distT="0" distB="0" distL="114300" distR="114300" simplePos="0" relativeHeight="251694080" behindDoc="0" locked="0" layoutInCell="1" allowOverlap="1" wp14:anchorId="54760E8B" wp14:editId="48E21A62">
+                <wp:anchor distT="0" distB="0" distL="114300" distR="114300" simplePos="0" relativeHeight="251694080" behindDoc="0" locked="0" layoutInCell="1" allowOverlap="1" wp14:anchorId="54760E8B" wp14:editId="25BDF6C6">
                   <wp:simplePos x="0" y="0"/>
                   <wp:positionH relativeFrom="column">
-                    <wp:posOffset>582295</wp:posOffset>
+                    <wp:posOffset>-65072</wp:posOffset>
                   </wp:positionH>
                   <wp:positionV relativeFrom="paragraph">
-                    <wp:posOffset>0</wp:posOffset>
+                    <wp:posOffset>601</wp:posOffset>
                   </wp:positionV>
-                  <wp:extent cx="5494020" cy="3804920"/>
-                  <wp:effectExtent l="0" t="0" r="0" b="0"/>
+                  <wp:extent cx="6617369" cy="4582903"/>
+                  <wp:effectExtent l="0" t="0" r="0" b="8255"/>
                   <wp:wrapTopAndBottom/>
                   <wp:docPr id="7" name="Picture 7"/>
                   <wp:cNvGraphicFramePr>
@@ -2708,7 +2708,7 @@
                         <pic:spPr>
                           <a:xfrm>
                             <a:off x="0" y="0"/>
-                            <a:ext cx="5494020" cy="3804920"/>
+                            <a:ext cx="6628359" cy="4590514"/>
                           </a:xfrm>
                           <a:prstGeom prst="rect">
                             <a:avLst/>
@@ -2765,23 +2765,17 @@
             </w:pPr>
             <w:r>
               <w:rPr>
+                <w:b/>
+                <w:bCs/>
                 <w:noProof/>
-                <w:sz w:val="22"/>
-                <w:szCs w:val="22"/>
+                <w:sz w:val="40"/>
+                <w:szCs w:val="40"/>
               </w:rPr>
               <w:drawing>
-                <wp:anchor distT="0" distB="0" distL="114300" distR="114300" simplePos="0" relativeHeight="251696128" behindDoc="0" locked="0" layoutInCell="1" allowOverlap="1" wp14:anchorId="77C9837D" wp14:editId="24A552D3">
-                  <wp:simplePos x="0" y="0"/>
-                  <wp:positionH relativeFrom="column">
-                    <wp:posOffset>760095</wp:posOffset>
-                  </wp:positionH>
-                  <wp:positionV relativeFrom="paragraph">
-                    <wp:posOffset>58420</wp:posOffset>
-                  </wp:positionV>
-                  <wp:extent cx="5146040" cy="4168140"/>
-                  <wp:effectExtent l="0" t="0" r="0" b="3810"/>
-                  <wp:wrapTopAndBottom/>
-                  <wp:docPr id="10" name="Picture 10"/>
+                <wp:inline distT="0" distB="0" distL="0" distR="0" wp14:anchorId="0294D6CF" wp14:editId="1708E65E">
+                  <wp:extent cx="6565900" cy="3248660"/>
+                  <wp:effectExtent l="0" t="0" r="6350" b="8890"/>
+                  <wp:docPr id="13" name="Picture 13"/>
                   <wp:cNvGraphicFramePr>
                     <a:graphicFrameLocks xmlns:a="http://schemas.openxmlformats.org/drawingml/2006/main" noChangeAspect="1"/>
                   </wp:cNvGraphicFramePr>
@@ -2789,11 +2783,87 @@
                     <a:graphicData uri="http://schemas.openxmlformats.org/drawingml/2006/picture">
                       <pic:pic xmlns:pic="http://schemas.openxmlformats.org/drawingml/2006/picture">
                         <pic:nvPicPr>
-                          <pic:cNvPr id="10" name="Picture 10"/>
+                          <pic:cNvPr id="1" name=""/>
                           <pic:cNvPicPr/>
                         </pic:nvPicPr>
                         <pic:blipFill>
-                          <a:blip r:embed="rId16" cstate="print">
+                          <a:blip r:embed="rId16"/>
+                          <a:stretch>
+                            <a:fillRect/>
+                          </a:stretch>
+                        </pic:blipFill>
+                        <pic:spPr>
+                          <a:xfrm>
+                            <a:off x="0" y="0"/>
+                            <a:ext cx="6565900" cy="3248660"/>
+                          </a:xfrm>
+                          <a:prstGeom prst="rect">
+                            <a:avLst/>
+                          </a:prstGeom>
+                        </pic:spPr>
+                      </pic:pic>
+                    </a:graphicData>
+                  </a:graphic>
+                </wp:inline>
+              </w:drawing>
+            </w:r>
+            <w:r>
+              <w:rPr>
+                <w:b/>
+                <w:bCs/>
+                <w:sz w:val="40"/>
+                <w:szCs w:val="40"/>
+              </w:rPr>
+              <w:t>Memo page</w:t>
+            </w:r>
+          </w:p>
+        </w:tc>
+      </w:tr>
+      <w:tr>
+        <w:tc>
+          <w:tcPr>
+            <w:tcW w:w="10330" w:type="dxa"/>
+          </w:tcPr>
+          <w:p>
+            <w:pPr>
+              <w:jc w:val="center"/>
+              <w:rPr>
+                <w:sz w:val="22"/>
+                <w:szCs w:val="22"/>
+              </w:rPr>
+            </w:pPr>
+            <w:r>
+              <w:rPr>
+                <w:noProof/>
+                <w:sz w:val="22"/>
+                <w:szCs w:val="22"/>
+              </w:rPr>
+              <w:lastRenderedPageBreak/>
+              <w:drawing>
+                <wp:anchor distT="0" distB="0" distL="114300" distR="114300" simplePos="0" relativeHeight="251711488" behindDoc="0" locked="0" layoutInCell="1" allowOverlap="1" wp14:anchorId="5647B396" wp14:editId="11F98D62">
+                  <wp:simplePos x="0" y="0"/>
+                  <wp:positionH relativeFrom="column">
+                    <wp:posOffset>770918</wp:posOffset>
+                  </wp:positionH>
+                  <wp:positionV relativeFrom="paragraph">
+                    <wp:posOffset>445</wp:posOffset>
+                  </wp:positionV>
+                  <wp:extent cx="5377570" cy="3953810"/>
+                  <wp:effectExtent l="0" t="0" r="0" b="8890"/>
+                  <wp:wrapTopAndBottom/>
+                  <wp:docPr id="14" name="Picture 14"/>
+                  <wp:cNvGraphicFramePr>
+                    <a:graphicFrameLocks xmlns:a="http://schemas.openxmlformats.org/drawingml/2006/main" noChangeAspect="1"/>
+                  </wp:cNvGraphicFramePr>
+                  <a:graphic xmlns:a="http://schemas.openxmlformats.org/drawingml/2006/main">
+                    <a:graphicData uri="http://schemas.openxmlformats.org/drawingml/2006/picture">
+                      <pic:pic xmlns:pic="http://schemas.openxmlformats.org/drawingml/2006/picture">
+                        <pic:nvPicPr>
+                          <pic:cNvPr id="14" name="Picture 14"/>
+                          <pic:cNvPicPr/>
+                        </pic:nvPicPr>
+                        <pic:blipFill>
+                          <a:blip r:embed="rId17" cstate="print">
                             <a:extLst>
                               <a:ext uri="{28A0092B-C50C-407E-A947-70E740481C1C}">
                                 <a14:useLocalDpi xmlns:a14="http://schemas.microsoft.com/office/drawing/2010/main" val="0"/>
@@ -2807,7 +2877,7 @@
                         <pic:spPr>
                           <a:xfrm>
                             <a:off x="0" y="0"/>
-                            <a:ext cx="5146040" cy="4168140"/>
+                            <a:ext cx="5379657" cy="3955344"/>
                           </a:xfrm>
                           <a:prstGeom prst="rect">
                             <a:avLst/>
@@ -2829,10 +2899,106 @@
               <w:rPr>
                 <w:b/>
                 <w:bCs/>
+                <w:sz w:val="42"/>
+                <w:szCs w:val="42"/>
+              </w:rPr>
+              <w:t>User Profile</w:t>
+            </w:r>
+          </w:p>
+        </w:tc>
+      </w:tr>
+      <w:tr>
+        <w:tc>
+          <w:tcPr>
+            <w:tcW w:w="10330" w:type="dxa"/>
+          </w:tcPr>
+          <w:p>
+            <w:pPr>
+              <w:jc w:val="center"/>
+              <w:rPr>
+                <w:noProof/>
+                <w:sz w:val="22"/>
+                <w:szCs w:val="22"/>
+              </w:rPr>
+            </w:pPr>
+            <w:r>
+              <w:rPr>
+                <w:noProof/>
+                <w:sz w:val="22"/>
+                <w:szCs w:val="22"/>
+              </w:rPr>
+              <w:drawing>
+                <wp:anchor distT="0" distB="0" distL="114300" distR="114300" simplePos="0" relativeHeight="251713536" behindDoc="0" locked="0" layoutInCell="1" allowOverlap="1" wp14:anchorId="47617133" wp14:editId="1283D404">
+                  <wp:simplePos x="0" y="0"/>
+                  <wp:positionH relativeFrom="column">
+                    <wp:posOffset>580589</wp:posOffset>
+                  </wp:positionH>
+                  <wp:positionV relativeFrom="paragraph">
+                    <wp:posOffset>569</wp:posOffset>
+                  </wp:positionV>
+                  <wp:extent cx="5336189" cy="4321712"/>
+                  <wp:effectExtent l="0" t="0" r="0" b="3175"/>
+                  <wp:wrapTopAndBottom/>
+                  <wp:docPr id="10" name="Picture 10"/>
+                  <wp:cNvGraphicFramePr>
+                    <a:graphicFrameLocks xmlns:a="http://schemas.openxmlformats.org/drawingml/2006/main" noChangeAspect="1"/>
+                  </wp:cNvGraphicFramePr>
+                  <a:graphic xmlns:a="http://schemas.openxmlformats.org/drawingml/2006/main">
+                    <a:graphicData uri="http://schemas.openxmlformats.org/drawingml/2006/picture">
+                      <pic:pic xmlns:pic="http://schemas.openxmlformats.org/drawingml/2006/picture">
+                        <pic:nvPicPr>
+                          <pic:cNvPr id="10" name="Picture 10"/>
+                          <pic:cNvPicPr/>
+                        </pic:nvPicPr>
+                        <pic:blipFill>
+                          <a:blip r:embed="rId18" cstate="print">
+                            <a:extLst>
+                              <a:ext uri="{28A0092B-C50C-407E-A947-70E740481C1C}">
+                                <a14:useLocalDpi xmlns:a14="http://schemas.microsoft.com/office/drawing/2010/main" val="0"/>
+                              </a:ext>
+                            </a:extLst>
+                          </a:blip>
+                          <a:stretch>
+                            <a:fillRect/>
+                          </a:stretch>
+                        </pic:blipFill>
+                        <pic:spPr>
+                          <a:xfrm>
+                            <a:off x="0" y="0"/>
+                            <a:ext cx="5339044" cy="4324024"/>
+                          </a:xfrm>
+                          <a:prstGeom prst="rect">
+                            <a:avLst/>
+                          </a:prstGeom>
+                        </pic:spPr>
+                      </pic:pic>
+                    </a:graphicData>
+                  </a:graphic>
+                  <wp14:sizeRelH relativeFrom="margin">
+                    <wp14:pctWidth>0</wp14:pctWidth>
+                  </wp14:sizeRelH>
+                  <wp14:sizeRelV relativeFrom="margin">
+                    <wp14:pctHeight>0</wp14:pctHeight>
+                  </wp14:sizeRelV>
+                </wp:anchor>
+              </w:drawing>
+            </w:r>
+            <w:r>
+              <w:rPr>
+                <w:b/>
+                <w:bCs/>
                 <w:sz w:val="40"/>
                 <w:szCs w:val="40"/>
               </w:rPr>
               <w:t>Admin Dashboard</w:t>
+            </w:r>
+            <w:r>
+              <w:rPr>
+                <w:noProof/>
+                <w:sz w:val="22"/>
+                <w:szCs w:val="22"/>
+              </w:rPr>
+              <w:t xml:space="preserve"> </w:t>
             </w:r>
           </w:p>
         </w:tc>
@@ -2864,6 +3030,7 @@
           </w:tcPr>
           <w:p>
             <w:pPr>
+              <w:jc w:val="center"/>
               <w:rPr>
                 <w:b/>
                 <w:bCs/>
@@ -2878,18 +3045,18 @@
                 <w:szCs w:val="22"/>
               </w:rPr>
               <w:drawing>
-                <wp:anchor distT="0" distB="0" distL="114300" distR="114300" simplePos="0" relativeHeight="251698176" behindDoc="0" locked="0" layoutInCell="1" allowOverlap="1" wp14:anchorId="1F1B2C4D" wp14:editId="0F344FF2">
+                <wp:anchor distT="0" distB="0" distL="114300" distR="114300" simplePos="0" relativeHeight="251710464" behindDoc="0" locked="0" layoutInCell="1" allowOverlap="1" wp14:anchorId="04731932" wp14:editId="407AD4A4">
                   <wp:simplePos x="0" y="0"/>
                   <wp:positionH relativeFrom="column">
-                    <wp:posOffset>725805</wp:posOffset>
+                    <wp:posOffset>894980</wp:posOffset>
                   </wp:positionH>
                   <wp:positionV relativeFrom="paragraph">
-                    <wp:posOffset>17145</wp:posOffset>
+                    <wp:posOffset>31854</wp:posOffset>
                   </wp:positionV>
                   <wp:extent cx="4928235" cy="3989070"/>
                   <wp:effectExtent l="0" t="0" r="5715" b="0"/>
                   <wp:wrapTopAndBottom/>
-                  <wp:docPr id="9" name="Picture 9"/>
+                  <wp:docPr id="4" name="Picture 4"/>
                   <wp:cNvGraphicFramePr>
                     <a:graphicFrameLocks xmlns:a="http://schemas.openxmlformats.org/drawingml/2006/main" noChangeAspect="1"/>
                   </wp:cNvGraphicFramePr>
@@ -2901,7 +3068,7 @@
                           <pic:cNvPicPr/>
                         </pic:nvPicPr>
                         <pic:blipFill>
-                          <a:blip r:embed="rId17" cstate="print">
+                          <a:blip r:embed="rId19" cstate="print">
                             <a:extLst>
                               <a:ext uri="{28A0092B-C50C-407E-A947-70E740481C1C}">
                                 <a14:useLocalDpi xmlns:a14="http://schemas.microsoft.com/office/drawing/2010/main" val="0"/>
@@ -2951,7 +3118,7 @@
                 <w:sz w:val="40"/>
                 <w:szCs w:val="40"/>
               </w:rPr>
-              <w:t>Admin</w:t>
+              <w:t xml:space="preserve"> </w:t>
             </w:r>
             <w:r>
               <w:rPr>
@@ -2960,7 +3127,7 @@
                 <w:sz w:val="40"/>
                 <w:szCs w:val="40"/>
               </w:rPr>
-              <w:t xml:space="preserve"> Dashboard</w:t>
+              <w:t>Admin</w:t>
             </w:r>
             <w:r>
               <w:rPr>
@@ -2969,16 +3136,44 @@
                 <w:sz w:val="40"/>
                 <w:szCs w:val="40"/>
               </w:rPr>
+              <w:t xml:space="preserve"> Dashboard</w:t>
+            </w:r>
+            <w:r>
+              <w:rPr>
+                <w:b/>
+                <w:bCs/>
+                <w:sz w:val="40"/>
+                <w:szCs w:val="40"/>
+              </w:rPr>
               <w:t xml:space="preserve"> Overview</w:t>
             </w:r>
           </w:p>
           <w:p>
             <w:pPr>
-              <w:rPr>
-                <w:b/>
-                <w:bCs/>
-                <w:sz w:val="22"/>
-                <w:szCs w:val="22"/>
+              <w:jc w:val="center"/>
+              <w:rPr>
+                <w:b/>
+                <w:bCs/>
+                <w:sz w:val="22"/>
+                <w:szCs w:val="22"/>
+              </w:rPr>
+            </w:pPr>
+          </w:p>
+        </w:tc>
+      </w:tr>
+      <w:tr>
+        <w:tc>
+          <w:tcPr>
+            <w:tcW w:w="10330" w:type="dxa"/>
+          </w:tcPr>
+          <w:p>
+            <w:pPr>
+              <w:jc w:val="center"/>
+              <w:rPr>
+                <w:b/>
+                <w:bCs/>
+                <w:sz w:val="40"/>
+                <w:szCs w:val="40"/>
               </w:rPr>
             </w:pPr>
             <w:r>
@@ -2988,13 +3183,13 @@
                 <w:szCs w:val="22"/>
               </w:rPr>
               <w:drawing>
-                <wp:anchor distT="0" distB="0" distL="114300" distR="114300" simplePos="0" relativeHeight="251700224" behindDoc="0" locked="0" layoutInCell="1" allowOverlap="1" wp14:anchorId="6652B32F" wp14:editId="63E24D36">
+                <wp:anchor distT="0" distB="0" distL="114300" distR="114300" simplePos="0" relativeHeight="251704320" behindDoc="0" locked="0" layoutInCell="1" allowOverlap="1" wp14:anchorId="5E4C1F93" wp14:editId="0CB1BDF1">
                   <wp:simplePos x="0" y="0"/>
                   <wp:positionH relativeFrom="column">
-                    <wp:posOffset>132080</wp:posOffset>
+                    <wp:posOffset>129540</wp:posOffset>
                   </wp:positionH>
                   <wp:positionV relativeFrom="paragraph">
-                    <wp:posOffset>213360</wp:posOffset>
+                    <wp:posOffset>23495</wp:posOffset>
                   </wp:positionV>
                   <wp:extent cx="6222365" cy="3790950"/>
                   <wp:effectExtent l="0" t="0" r="6985" b="0"/>
@@ -3011,7 +3206,7 @@
                           <pic:cNvPicPr/>
                         </pic:nvPicPr>
                         <pic:blipFill>
-                          <a:blip r:embed="rId18">
+                          <a:blip r:embed="rId20">
                             <a:extLst>
                               <a:ext uri="{28A0092B-C50C-407E-A947-70E740481C1C}">
                                 <a14:useLocalDpi xmlns:a14="http://schemas.microsoft.com/office/drawing/2010/main" val="0"/>
@@ -3043,24 +3238,6 @@
                 </wp:anchor>
               </w:drawing>
             </w:r>
-          </w:p>
-        </w:tc>
-      </w:tr>
-      <w:tr>
-        <w:tc>
-          <w:tcPr>
-            <w:tcW w:w="10330" w:type="dxa"/>
-          </w:tcPr>
-          <w:p>
-            <w:pPr>
-              <w:jc w:val="center"/>
-              <w:rPr>
-                <w:b/>
-                <w:bCs/>
-                <w:sz w:val="22"/>
-                <w:szCs w:val="22"/>
-              </w:rPr>
-            </w:pPr>
             <w:r>
               <w:rPr>
                 <w:b/>
@@ -3068,7 +3245,7 @@
                 <w:sz w:val="40"/>
                 <w:szCs w:val="40"/>
               </w:rPr>
-              <w:t>Admin Inventory Managment</w:t>
+              <w:t>Admin Inventory Management</w:t>
             </w:r>
           </w:p>
         </w:tc>
@@ -4098,6 +4275,22 @@
     </w:p>
     <w:p>
       <w:pPr>
+        <w:rPr>
+          <w:sz w:val="22"/>
+          <w:szCs w:val="22"/>
+        </w:rPr>
+      </w:pPr>
+      <w:r>
+        <w:rPr>
+          <w:sz w:val="22"/>
+          <w:szCs w:val="22"/>
+        </w:rPr>
+        <w:br w:type="page"/>
+      </w:r>
+    </w:p>
+    <w:p>
+      <w:pPr>
+        <w:spacing w:before="220" w:after="100"/>
         <w:rPr>
           <w:sz w:val="22"/>
           <w:szCs w:val="22"/>
@@ -5499,7 +5692,7 @@
   <w:style w:type="paragraph" w:default="1" w:styleId="Normal">
     <w:name w:val="Normal"/>
     <w:qFormat/>
-    <w:rsid w:val="00B3151F"/>
+    <w:rsid w:val="006C77A2"/>
   </w:style>
   <w:style w:type="paragraph" w:styleId="Heading1">
     <w:name w:val="heading 1"/>

</xml_diff>